<commit_message>
add new mappings, update path
</commit_message>
<xml_diff>
--- a/src/templates/template_Haulage_Instruction.docx
+++ b/src/templates/template_Haulage_Instruction.docx
@@ -27,10 +27,10 @@
         <mc:AlternateContent>
           <mc:Choice Requires="wps">
             <w:drawing>
-              <wp:anchor distT="0" distB="0" distL="114300" distR="114300" simplePos="0" relativeHeight="251660288" behindDoc="0" locked="0" layoutInCell="1" allowOverlap="1" wp14:anchorId="1DB04DF8" wp14:editId="399556E6">
+              <wp:anchor distT="0" distB="0" distL="114300" distR="114300" simplePos="0" relativeHeight="251660288" behindDoc="0" locked="0" layoutInCell="1" allowOverlap="1" wp14:anchorId="1DB04DF8" wp14:editId="5EB12EBF">
                 <wp:simplePos x="0" y="0"/>
                 <wp:positionH relativeFrom="column">
-                  <wp:posOffset>2228850</wp:posOffset>
+                  <wp:posOffset>1809750</wp:posOffset>
                 </wp:positionH>
                 <wp:positionV relativeFrom="paragraph">
                   <wp:posOffset>-252730</wp:posOffset>
@@ -557,7 +557,7 @@
                 <v:stroke joinstyle="miter"/>
                 <v:path gradientshapeok="t" o:connecttype="rect"/>
               </v:shapetype>
-              <v:shape id="Text Box 5" o:spid="_x0000_s1026" type="#_x0000_t202" style="position:absolute;margin-left:175.5pt;margin-top:-19.9pt;width:385.5pt;height:144.75pt;z-index:251660288;visibility:visible;mso-wrap-style:square;mso-width-percent:0;mso-wrap-distance-left:9pt;mso-wrap-distance-top:0;mso-wrap-distance-right:9pt;mso-wrap-distance-bottom:0;mso-position-horizontal:absolute;mso-position-horizontal-relative:text;mso-position-vertical:absolute;mso-position-vertical-relative:text;mso-width-percent:0;mso-width-relative:margin;v-text-anchor:top" o:gfxdata="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" filled="f" stroked="f">
+              <v:shape id="Text Box 5" o:spid="_x0000_s1026" type="#_x0000_t202" style="position:absolute;margin-left:142.5pt;margin-top:-19.9pt;width:385.5pt;height:144.75pt;z-index:251660288;visibility:visible;mso-wrap-style:square;mso-width-percent:0;mso-wrap-distance-left:9pt;mso-wrap-distance-top:0;mso-wrap-distance-right:9pt;mso-wrap-distance-bottom:0;mso-position-horizontal:absolute;mso-position-horizontal-relative:text;mso-position-vertical:absolute;mso-position-vertical-relative:text;mso-width-percent:0;mso-width-relative:margin;v-text-anchor:top" o:gfxdata="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" filled="f" stroked="f">
                 <v:textbox>
                   <w:txbxContent>
                     <w:p>
@@ -1606,10 +1606,7 @@
             </w:r>
             <w:proofErr w:type="spellEnd"/>
             <w:r>
-              <w:t xml:space="preserve">} </w:t>
-            </w:r>
-            <w:r>
-              <w:t>{</w:t>
+              <w:t>} {</w:t>
             </w:r>
             <w:proofErr w:type="spellStart"/>
             <w:r>
@@ -1668,18 +1665,19 @@
           <w:insideH w:val="single" w:sz="4" w:space="0" w:color="auto"/>
           <w:insideV w:val="single" w:sz="4" w:space="0" w:color="auto"/>
         </w:tblBorders>
+        <w:tblLayout w:type="fixed"/>
         <w:tblLook w:val="01E0" w:firstRow="1" w:lastRow="1" w:firstColumn="1" w:lastColumn="1" w:noHBand="0" w:noVBand="0"/>
       </w:tblPr>
       <w:tblGrid>
-        <w:gridCol w:w="1197"/>
-        <w:gridCol w:w="4227"/>
-        <w:gridCol w:w="1106"/>
-        <w:gridCol w:w="3926"/>
+        <w:gridCol w:w="1705"/>
+        <w:gridCol w:w="3719"/>
+        <w:gridCol w:w="1231"/>
+        <w:gridCol w:w="3801"/>
       </w:tblGrid>
       <w:tr>
         <w:tc>
           <w:tcPr>
-            <w:tcW w:w="2808" w:type="dxa"/>
+            <w:tcW w:w="1705" w:type="dxa"/>
           </w:tcPr>
           <w:p>
             <w:r>
@@ -1689,7 +1687,7 @@
         </w:tc>
         <w:tc>
           <w:tcPr>
-            <w:tcW w:w="4500" w:type="dxa"/>
+            <w:tcW w:w="3719" w:type="dxa"/>
           </w:tcPr>
           <w:p>
             <w:r>
@@ -1735,7 +1733,7 @@
         </w:tc>
         <w:tc>
           <w:tcPr>
-            <w:tcW w:w="1440" w:type="dxa"/>
+            <w:tcW w:w="1231" w:type="dxa"/>
           </w:tcPr>
           <w:p>
             <w:r>
@@ -1745,7 +1743,7 @@
         </w:tc>
         <w:tc>
           <w:tcPr>
-            <w:tcW w:w="2048" w:type="dxa"/>
+            <w:tcW w:w="3801" w:type="dxa"/>
           </w:tcPr>
           <w:p>
             <w:pPr>
@@ -3309,6 +3307,7 @@
   <w:style w:type="character" w:default="1" w:styleId="DefaultParagraphFont">
     <w:name w:val="Default Paragraph Font"/>
     <w:uiPriority w:val="1"/>
+    <w:semiHidden/>
     <w:unhideWhenUsed/>
   </w:style>
   <w:style w:type="table" w:default="1" w:styleId="TableNormal">

</xml_diff>

<commit_message>
update 8/9 objects tickets
</commit_message>
<xml_diff>
--- a/src/templates/template_Haulage_Instruction.docx
+++ b/src/templates/template_Haulage_Instruction.docx
@@ -81,7 +81,15 @@
                               </w:rPr>
                             </w:pPr>
                             <w:r>
-                              <w:t>{#header_show}{#header_logo_only}</w:t>
+                              <w:t>{#header_</w:t>
+                            </w:r>
+                            <w:proofErr w:type="gramStart"/>
+                            <w:r>
+                              <w:t>show}{</w:t>
+                            </w:r>
+                            <w:proofErr w:type="gramEnd"/>
+                            <w:r>
+                              <w:t>#header_logo_only}</w:t>
                             </w:r>
                             <w:r>
                               <w:t>{</w:t>
@@ -92,14 +100,12 @@
                               </w:rPr>
                               <w:t>/</w:t>
                             </w:r>
-                            <w:proofErr w:type="spellStart"/>
                             <w:r>
                               <w:rPr>
                                 <w:lang w:val="en-US"/>
                               </w:rPr>
                               <w:t>header_logo_only</w:t>
                             </w:r>
-                            <w:proofErr w:type="spellEnd"/>
                             <w:r>
                               <w:t>}</w:t>
                             </w:r>
@@ -133,23 +139,7 @@
                                 <w:sz w:val="14"/>
                                 <w:szCs w:val="14"/>
                               </w:rPr>
-                              <w:t>{</w:t>
-                            </w:r>
-                            <w:proofErr w:type="spellStart"/>
-                            <w:r>
-                              <w:rPr>
-                                <w:sz w:val="14"/>
-                                <w:szCs w:val="14"/>
-                              </w:rPr>
-                              <w:t>company_info_organization_name</w:t>
-                            </w:r>
-                            <w:proofErr w:type="spellEnd"/>
-                            <w:r>
-                              <w:rPr>
-                                <w:sz w:val="14"/>
-                                <w:szCs w:val="14"/>
-                              </w:rPr>
-                              <w:t>}</w:t>
+                              <w:t>{company_info_organization_name}</w:t>
                             </w:r>
                           </w:p>
                           <w:p>
@@ -165,25 +155,7 @@
                                 <w:szCs w:val="14"/>
                                 <w:lang w:val="en-US"/>
                               </w:rPr>
-                              <w:t>{</w:t>
-                            </w:r>
-                            <w:proofErr w:type="spellStart"/>
-                            <w:r>
-                              <w:rPr>
-                                <w:sz w:val="14"/>
-                                <w:szCs w:val="14"/>
-                                <w:lang w:val="en-US"/>
-                              </w:rPr>
-                              <w:t>company_info_address</w:t>
-                            </w:r>
-                            <w:proofErr w:type="spellEnd"/>
-                            <w:r>
-                              <w:rPr>
-                                <w:sz w:val="14"/>
-                                <w:szCs w:val="14"/>
-                                <w:lang w:val="en-US"/>
-                              </w:rPr>
-                              <w:t>}</w:t>
+                              <w:t>{company_info_address}</w:t>
                             </w:r>
                           </w:p>
                           <w:p>
@@ -201,25 +173,7 @@
                                 <w:szCs w:val="14"/>
                                 <w:lang w:val="en-US"/>
                               </w:rPr>
-                              <w:t>{</w:t>
-                            </w:r>
-                            <w:proofErr w:type="spellStart"/>
-                            <w:r>
-                              <w:rPr>
-                                <w:sz w:val="14"/>
-                                <w:szCs w:val="14"/>
-                                <w:lang w:val="en-US"/>
-                              </w:rPr>
-                              <w:t>company_info_postcode</w:t>
-                            </w:r>
-                            <w:proofErr w:type="spellEnd"/>
-                            <w:r>
-                              <w:rPr>
-                                <w:sz w:val="14"/>
-                                <w:szCs w:val="14"/>
-                                <w:lang w:val="en-US"/>
-                              </w:rPr>
-                              <w:t>}</w:t>
+                              <w:t>{company_info_postcode}</w:t>
                             </w:r>
                           </w:p>
                           <w:p>
@@ -243,11 +197,13 @@
                             </w:pPr>
                             <w:r>
                               <w:rPr>
+                                <w:b/>
+                                <w:bCs/>
                                 <w:sz w:val="14"/>
                                 <w:szCs w:val="14"/>
                                 <w:lang w:val="en-US"/>
                               </w:rPr>
-                              <w:t xml:space="preserve">Telephone: </w:t>
+                              <w:t>Telephone:</w:t>
                             </w:r>
                             <w:r>
                               <w:rPr>
@@ -255,25 +211,15 @@
                                 <w:szCs w:val="14"/>
                                 <w:lang w:val="en-US"/>
                               </w:rPr>
-                              <w:t>{</w:t>
-                            </w:r>
-                            <w:proofErr w:type="spellStart"/>
+                              <w:t xml:space="preserve"> </w:t>
+                            </w:r>
                             <w:r>
                               <w:rPr>
                                 <w:sz w:val="14"/>
                                 <w:szCs w:val="14"/>
                                 <w:lang w:val="en-US"/>
                               </w:rPr>
-                              <w:t>company_info_telephone</w:t>
-                            </w:r>
-                            <w:proofErr w:type="spellEnd"/>
-                            <w:r>
-                              <w:rPr>
-                                <w:sz w:val="14"/>
-                                <w:szCs w:val="14"/>
-                                <w:lang w:val="en-US"/>
-                              </w:rPr>
-                              <w:t>}</w:t>
+                              <w:t>{company_info_telephone}</w:t>
                             </w:r>
                           </w:p>
                           <w:p>
@@ -295,29 +241,20 @@
                             </w:r>
                             <w:r>
                               <w:rPr>
+                                <w:b/>
                                 <w:sz w:val="14"/>
                                 <w:szCs w:val="14"/>
                                 <w:lang w:val="en-US"/>
                               </w:rPr>
-                              <w:t>{</w:t>
-                            </w:r>
-                            <w:proofErr w:type="spellStart"/>
+                              <w:t xml:space="preserve"> </w:t>
+                            </w:r>
                             <w:r>
                               <w:rPr>
                                 <w:sz w:val="14"/>
                                 <w:szCs w:val="14"/>
                                 <w:lang w:val="en-US"/>
                               </w:rPr>
-                              <w:t>company_info_fax</w:t>
-                            </w:r>
-                            <w:proofErr w:type="spellEnd"/>
-                            <w:r>
-                              <w:rPr>
-                                <w:sz w:val="14"/>
-                                <w:szCs w:val="14"/>
-                                <w:lang w:val="en-US"/>
-                              </w:rPr>
-                              <w:t>}</w:t>
+                              <w:t>{company_info_fax}</w:t>
                             </w:r>
                           </w:p>
                           <w:p>
@@ -341,6 +278,8 @@
                             </w:pPr>
                             <w:r>
                               <w:rPr>
+                                <w:b/>
+                                <w:bCs/>
                                 <w:sz w:val="14"/>
                                 <w:szCs w:val="14"/>
                                 <w:lang w:val="en-US"/>
@@ -361,25 +300,7 @@
                                 <w:szCs w:val="14"/>
                                 <w:lang w:val="en-US"/>
                               </w:rPr>
-                              <w:t>{</w:t>
-                            </w:r>
-                            <w:proofErr w:type="spellStart"/>
-                            <w:r>
-                              <w:rPr>
-                                <w:sz w:val="14"/>
-                                <w:szCs w:val="14"/>
-                                <w:lang w:val="en-US"/>
-                              </w:rPr>
-                              <w:t>company_info_email</w:t>
-                            </w:r>
-                            <w:proofErr w:type="spellEnd"/>
-                            <w:r>
-                              <w:rPr>
-                                <w:sz w:val="14"/>
-                                <w:szCs w:val="14"/>
-                                <w:lang w:val="en-US"/>
-                              </w:rPr>
-                              <w:t>}</w:t>
+                              <w:t>{company_info_email}</w:t>
                             </w:r>
                           </w:p>
                           <w:p>
@@ -405,25 +326,7 @@
                                 <w:szCs w:val="14"/>
                                 <w:lang w:val="en-US"/>
                               </w:rPr>
-                              <w:t>{</w:t>
-                            </w:r>
-                            <w:proofErr w:type="spellStart"/>
-                            <w:r>
-                              <w:rPr>
-                                <w:sz w:val="14"/>
-                                <w:szCs w:val="14"/>
-                                <w:lang w:val="en-US"/>
-                              </w:rPr>
-                              <w:t>company_info_web</w:t>
-                            </w:r>
-                            <w:proofErr w:type="spellEnd"/>
-                            <w:r>
-                              <w:rPr>
-                                <w:sz w:val="14"/>
-                                <w:szCs w:val="14"/>
-                                <w:lang w:val="en-US"/>
-                              </w:rPr>
-                              <w:t>}</w:t>
+                              <w:t>{company_info_web}</w:t>
                             </w:r>
                             <w:r>
                               <w:rPr>
@@ -459,25 +362,7 @@
                                 <w:szCs w:val="14"/>
                                 <w:lang w:val="en-US"/>
                               </w:rPr>
-                              <w:t>{/</w:t>
-                            </w:r>
-                            <w:proofErr w:type="spellStart"/>
-                            <w:r>
-                              <w:rPr>
-                                <w:sz w:val="14"/>
-                                <w:szCs w:val="14"/>
-                                <w:lang w:val="en-US"/>
-                              </w:rPr>
-                              <w:t>header_show_full</w:t>
-                            </w:r>
-                            <w:proofErr w:type="spellEnd"/>
-                            <w:r>
-                              <w:rPr>
-                                <w:sz w:val="14"/>
-                                <w:szCs w:val="14"/>
-                                <w:lang w:val="en-US"/>
-                              </w:rPr>
-                              <w:t>}</w:t>
+                              <w:t>{/header_show_full}</w:t>
                             </w:r>
                           </w:p>
                           <w:p>
@@ -495,25 +380,7 @@
                                 <w:szCs w:val="14"/>
                                 <w:lang w:val="en-US"/>
                               </w:rPr>
-                              <w:t>{/</w:t>
-                            </w:r>
-                            <w:proofErr w:type="spellStart"/>
-                            <w:r>
-                              <w:rPr>
-                                <w:sz w:val="14"/>
-                                <w:szCs w:val="14"/>
-                                <w:lang w:val="en-US"/>
-                              </w:rPr>
-                              <w:t>header_show</w:t>
-                            </w:r>
-                            <w:proofErr w:type="spellEnd"/>
-                            <w:r>
-                              <w:rPr>
-                                <w:sz w:val="14"/>
-                                <w:szCs w:val="14"/>
-                                <w:lang w:val="en-US"/>
-                              </w:rPr>
-                              <w:t>}</w:t>
+                              <w:t>{/header_show}</w:t>
                             </w:r>
                           </w:p>
                           <w:p>
@@ -577,14 +444,12 @@
                         </w:rPr>
                         <w:t>/</w:t>
                       </w:r>
-                      <w:proofErr w:type="spellStart"/>
                       <w:r>
                         <w:rPr>
                           <w:lang w:val="en-US"/>
                         </w:rPr>
                         <w:t>header_logo_only</w:t>
                       </w:r>
-                      <w:proofErr w:type="spellEnd"/>
                       <w:r>
                         <w:t>}</w:t>
                       </w:r>
@@ -618,23 +483,7 @@
                           <w:sz w:val="14"/>
                           <w:szCs w:val="14"/>
                         </w:rPr>
-                        <w:t>{</w:t>
-                      </w:r>
-                      <w:proofErr w:type="spellStart"/>
-                      <w:r>
-                        <w:rPr>
-                          <w:sz w:val="14"/>
-                          <w:szCs w:val="14"/>
-                        </w:rPr>
-                        <w:t>company_info_organization_name</w:t>
-                      </w:r>
-                      <w:proofErr w:type="spellEnd"/>
-                      <w:r>
-                        <w:rPr>
-                          <w:sz w:val="14"/>
-                          <w:szCs w:val="14"/>
-                        </w:rPr>
-                        <w:t>}</w:t>
+                        <w:t>{company_info_organization_name}</w:t>
                       </w:r>
                     </w:p>
                     <w:p>
@@ -650,25 +499,7 @@
                           <w:szCs w:val="14"/>
                           <w:lang w:val="en-US"/>
                         </w:rPr>
-                        <w:t>{</w:t>
-                      </w:r>
-                      <w:proofErr w:type="spellStart"/>
-                      <w:r>
-                        <w:rPr>
-                          <w:sz w:val="14"/>
-                          <w:szCs w:val="14"/>
-                          <w:lang w:val="en-US"/>
-                        </w:rPr>
-                        <w:t>company_info_address</w:t>
-                      </w:r>
-                      <w:proofErr w:type="spellEnd"/>
-                      <w:r>
-                        <w:rPr>
-                          <w:sz w:val="14"/>
-                          <w:szCs w:val="14"/>
-                          <w:lang w:val="en-US"/>
-                        </w:rPr>
-                        <w:t>}</w:t>
+                        <w:t>{company_info_address}</w:t>
                       </w:r>
                     </w:p>
                     <w:p>
@@ -686,25 +517,7 @@
                           <w:szCs w:val="14"/>
                           <w:lang w:val="en-US"/>
                         </w:rPr>
-                        <w:t>{</w:t>
-                      </w:r>
-                      <w:proofErr w:type="spellStart"/>
-                      <w:r>
-                        <w:rPr>
-                          <w:sz w:val="14"/>
-                          <w:szCs w:val="14"/>
-                          <w:lang w:val="en-US"/>
-                        </w:rPr>
-                        <w:t>company_info_postcode</w:t>
-                      </w:r>
-                      <w:proofErr w:type="spellEnd"/>
-                      <w:r>
-                        <w:rPr>
-                          <w:sz w:val="14"/>
-                          <w:szCs w:val="14"/>
-                          <w:lang w:val="en-US"/>
-                        </w:rPr>
-                        <w:t>}</w:t>
+                        <w:t>{company_info_postcode}</w:t>
                       </w:r>
                     </w:p>
                     <w:p>
@@ -728,11 +541,13 @@
                       </w:pPr>
                       <w:r>
                         <w:rPr>
+                          <w:b/>
+                          <w:bCs/>
                           <w:sz w:val="14"/>
                           <w:szCs w:val="14"/>
                           <w:lang w:val="en-US"/>
                         </w:rPr>
-                        <w:t xml:space="preserve">Telephone: </w:t>
+                        <w:t>Telephone:</w:t>
                       </w:r>
                       <w:r>
                         <w:rPr>
@@ -740,25 +555,15 @@
                           <w:szCs w:val="14"/>
                           <w:lang w:val="en-US"/>
                         </w:rPr>
-                        <w:t>{</w:t>
-                      </w:r>
-                      <w:proofErr w:type="spellStart"/>
+                        <w:t xml:space="preserve"> </w:t>
+                      </w:r>
                       <w:r>
                         <w:rPr>
                           <w:sz w:val="14"/>
                           <w:szCs w:val="14"/>
                           <w:lang w:val="en-US"/>
                         </w:rPr>
-                        <w:t>company_info_telephone</w:t>
-                      </w:r>
-                      <w:proofErr w:type="spellEnd"/>
-                      <w:r>
-                        <w:rPr>
-                          <w:sz w:val="14"/>
-                          <w:szCs w:val="14"/>
-                          <w:lang w:val="en-US"/>
-                        </w:rPr>
-                        <w:t>}</w:t>
+                        <w:t>{company_info_telephone}</w:t>
                       </w:r>
                     </w:p>
                     <w:p>
@@ -770,7 +575,6 @@
                           <w:lang w:val="en-US"/>
                         </w:rPr>
                       </w:pPr>
-                      <w:proofErr w:type="gramStart"/>
                       <w:r>
                         <w:rPr>
                           <w:b/>
@@ -781,30 +585,20 @@
                       </w:r>
                       <w:r>
                         <w:rPr>
+                          <w:b/>
                           <w:sz w:val="14"/>
                           <w:szCs w:val="14"/>
                           <w:lang w:val="en-US"/>
                         </w:rPr>
-                        <w:t>{</w:t>
-                      </w:r>
-                      <w:proofErr w:type="spellStart"/>
-                      <w:proofErr w:type="gramEnd"/>
+                        <w:t xml:space="preserve"> </w:t>
+                      </w:r>
                       <w:r>
                         <w:rPr>
                           <w:sz w:val="14"/>
                           <w:szCs w:val="14"/>
                           <w:lang w:val="en-US"/>
                         </w:rPr>
-                        <w:t>company_info_fax</w:t>
-                      </w:r>
-                      <w:proofErr w:type="spellEnd"/>
-                      <w:r>
-                        <w:rPr>
-                          <w:sz w:val="14"/>
-                          <w:szCs w:val="14"/>
-                          <w:lang w:val="en-US"/>
-                        </w:rPr>
-                        <w:t>}</w:t>
+                        <w:t>{company_info_fax}</w:t>
                       </w:r>
                     </w:p>
                     <w:p>
@@ -828,6 +622,8 @@
                       </w:pPr>
                       <w:r>
                         <w:rPr>
+                          <w:b/>
+                          <w:bCs/>
                           <w:sz w:val="14"/>
                           <w:szCs w:val="14"/>
                           <w:lang w:val="en-US"/>
@@ -848,25 +644,7 @@
                           <w:szCs w:val="14"/>
                           <w:lang w:val="en-US"/>
                         </w:rPr>
-                        <w:t>{</w:t>
-                      </w:r>
-                      <w:proofErr w:type="spellStart"/>
-                      <w:r>
-                        <w:rPr>
-                          <w:sz w:val="14"/>
-                          <w:szCs w:val="14"/>
-                          <w:lang w:val="en-US"/>
-                        </w:rPr>
-                        <w:t>company_info_email</w:t>
-                      </w:r>
-                      <w:proofErr w:type="spellEnd"/>
-                      <w:r>
-                        <w:rPr>
-                          <w:sz w:val="14"/>
-                          <w:szCs w:val="14"/>
-                          <w:lang w:val="en-US"/>
-                        </w:rPr>
-                        <w:t>}</w:t>
+                        <w:t>{company_info_email}</w:t>
                       </w:r>
                     </w:p>
                     <w:p>
@@ -892,25 +670,7 @@
                           <w:szCs w:val="14"/>
                           <w:lang w:val="en-US"/>
                         </w:rPr>
-                        <w:t>{</w:t>
-                      </w:r>
-                      <w:proofErr w:type="spellStart"/>
-                      <w:r>
-                        <w:rPr>
-                          <w:sz w:val="14"/>
-                          <w:szCs w:val="14"/>
-                          <w:lang w:val="en-US"/>
-                        </w:rPr>
-                        <w:t>company_info_web</w:t>
-                      </w:r>
-                      <w:proofErr w:type="spellEnd"/>
-                      <w:r>
-                        <w:rPr>
-                          <w:sz w:val="14"/>
-                          <w:szCs w:val="14"/>
-                          <w:lang w:val="en-US"/>
-                        </w:rPr>
-                        <w:t>}</w:t>
+                        <w:t>{company_info_web}</w:t>
                       </w:r>
                       <w:r>
                         <w:rPr>
@@ -946,25 +706,7 @@
                           <w:szCs w:val="14"/>
                           <w:lang w:val="en-US"/>
                         </w:rPr>
-                        <w:t>{/</w:t>
-                      </w:r>
-                      <w:proofErr w:type="spellStart"/>
-                      <w:r>
-                        <w:rPr>
-                          <w:sz w:val="14"/>
-                          <w:szCs w:val="14"/>
-                          <w:lang w:val="en-US"/>
-                        </w:rPr>
-                        <w:t>header_show_full</w:t>
-                      </w:r>
-                      <w:proofErr w:type="spellEnd"/>
-                      <w:r>
-                        <w:rPr>
-                          <w:sz w:val="14"/>
-                          <w:szCs w:val="14"/>
-                          <w:lang w:val="en-US"/>
-                        </w:rPr>
-                        <w:t>}</w:t>
+                        <w:t>{/header_show_full}</w:t>
                       </w:r>
                     </w:p>
                     <w:p>
@@ -982,25 +724,7 @@
                           <w:szCs w:val="14"/>
                           <w:lang w:val="en-US"/>
                         </w:rPr>
-                        <w:t>{/</w:t>
-                      </w:r>
-                      <w:proofErr w:type="spellStart"/>
-                      <w:r>
-                        <w:rPr>
-                          <w:sz w:val="14"/>
-                          <w:szCs w:val="14"/>
-                          <w:lang w:val="en-US"/>
-                        </w:rPr>
-                        <w:t>header_show</w:t>
-                      </w:r>
-                      <w:proofErr w:type="spellEnd"/>
-                      <w:r>
-                        <w:rPr>
-                          <w:sz w:val="14"/>
-                          <w:szCs w:val="14"/>
-                          <w:lang w:val="en-US"/>
-                        </w:rPr>
-                        <w:t>}</w:t>
+                        <w:t>{/header_show}</w:t>
                       </w:r>
                     </w:p>
                     <w:p>
@@ -1073,7 +797,15 @@
                         <w:txbxContent>
                           <w:p>
                             <w:r>
-                              <w:t>{#header_show}{#header_logo_only}</w:t>
+                              <w:t>{#header_</w:t>
+                            </w:r>
+                            <w:proofErr w:type="gramStart"/>
+                            <w:r>
+                              <w:t>show}{</w:t>
+                            </w:r>
+                            <w:proofErr w:type="gramEnd"/>
+                            <w:r>
+                              <w:t>#header_logo_only}</w:t>
                             </w:r>
                             <w:r>
                               <w:t>{%header_logo}</w:t>
@@ -1087,14 +819,12 @@
                               </w:rPr>
                               <w:t>/</w:t>
                             </w:r>
-                            <w:proofErr w:type="spellStart"/>
                             <w:r>
                               <w:rPr>
                                 <w:lang w:val="en-US"/>
                               </w:rPr>
                               <w:t>header_logo_only</w:t>
                             </w:r>
-                            <w:proofErr w:type="spellEnd"/>
                             <w:r>
                               <w:t>}</w:t>
                             </w:r>
@@ -1303,15 +1033,7 @@
               </w:rPr>
             </w:pPr>
             <w:r>
-              <w:t>{</w:t>
-            </w:r>
-            <w:proofErr w:type="spellStart"/>
-            <w:r>
-              <w:t>instruction_no</w:t>
-            </w:r>
-            <w:proofErr w:type="spellEnd"/>
-            <w:r>
-              <w:t>}</w:t>
+              <w:t>{instruction_no}</w:t>
             </w:r>
           </w:p>
         </w:tc>
@@ -1332,20 +1054,34 @@
             <w:tcW w:w="7616" w:type="dxa"/>
           </w:tcPr>
           <w:p>
+            <w:pPr>
+              <w:rPr>
+                <w:lang w:val="en-US"/>
+              </w:rPr>
+            </w:pPr>
             <w:r>
               <w:t>{</w:t>
             </w:r>
-            <w:proofErr w:type="spellStart"/>
-            <w:r>
-              <w:t>Delivery_Instruction__c</w:t>
-            </w:r>
-            <w:r>
-              <w:t>.</w:t>
-            </w:r>
-            <w:r>
-              <w:t>Date_Created__с</w:t>
-            </w:r>
-            <w:proofErr w:type="spellEnd"/>
+            <w:r>
+              <w:rPr>
+                <w:lang w:val="en-US"/>
+              </w:rPr>
+              <w:t>Delivery_Instruction__</w:t>
+            </w:r>
+            <w:proofErr w:type="gramStart"/>
+            <w:r>
+              <w:rPr>
+                <w:lang w:val="en-US"/>
+              </w:rPr>
+              <w:t>c.Date</w:t>
+            </w:r>
+            <w:proofErr w:type="gramEnd"/>
+            <w:r>
+              <w:rPr>
+                <w:lang w:val="en-US"/>
+              </w:rPr>
+              <w:t>_Created__c</w:t>
+            </w:r>
             <w:r>
               <w:t>}</w:t>
             </w:r>
@@ -1368,23 +1104,28 @@
             <w:tcW w:w="7616" w:type="dxa"/>
           </w:tcPr>
           <w:p>
+            <w:pPr>
+              <w:rPr>
+                <w:lang w:val="en-US"/>
+              </w:rPr>
+            </w:pPr>
             <w:r>
               <w:t>{</w:t>
             </w:r>
             <w:r>
+              <w:rPr>
+                <w:lang w:val="en-US"/>
+              </w:rPr>
               <w:t>Movement_Sheet__</w:t>
             </w:r>
-            <w:proofErr w:type="spellStart"/>
-            <w:r>
-              <w:t>c</w:t>
-            </w:r>
-            <w:r>
-              <w:t>.</w:t>
-            </w:r>
-            <w:r>
-              <w:t>Name</w:t>
-            </w:r>
-            <w:proofErr w:type="spellEnd"/>
+            <w:proofErr w:type="gramStart"/>
+            <w:r>
+              <w:rPr>
+                <w:lang w:val="en-US"/>
+              </w:rPr>
+              <w:t>c.Name</w:t>
+            </w:r>
+            <w:proofErr w:type="gramEnd"/>
             <w:r>
               <w:t>}</w:t>
             </w:r>
@@ -1420,8 +1161,8 @@
         <w:tblLook w:val="01E0" w:firstRow="1" w:lastRow="1" w:firstColumn="1" w:lastColumn="1" w:noHBand="0" w:noVBand="0"/>
       </w:tblPr>
       <w:tblGrid>
-        <w:gridCol w:w="2687"/>
-        <w:gridCol w:w="7769"/>
+        <w:gridCol w:w="2713"/>
+        <w:gridCol w:w="7743"/>
       </w:tblGrid>
       <w:tr>
         <w:trPr>
@@ -1445,17 +1186,17 @@
             <w:r>
               <w:t>{</w:t>
             </w:r>
-            <w:proofErr w:type="spellStart"/>
-            <w:r>
-              <w:t>Haulage_Instruction__c</w:t>
-            </w:r>
-            <w:r>
-              <w:t>.</w:t>
-            </w:r>
-            <w:r>
-              <w:t>Haulier__c</w:t>
-            </w:r>
-            <w:proofErr w:type="spellEnd"/>
+            <w:r>
+              <w:t>Haulier__</w:t>
+            </w:r>
+            <w:proofErr w:type="gramStart"/>
+            <w:r>
+              <w:t>c</w:t>
+            </w:r>
+            <w:r>
+              <w:t>.Name</w:t>
+            </w:r>
+            <w:proofErr w:type="gramEnd"/>
             <w:r>
               <w:t>}</w:t>
             </w:r>
@@ -1500,25 +1241,21 @@
             <w:tcW w:w="7988" w:type="dxa"/>
           </w:tcPr>
           <w:p>
-            <w:r>
-              <w:t>{</w:t>
-            </w:r>
-            <w:r>
-              <w:t>Haulage_Instruction__</w:t>
-            </w:r>
-            <w:proofErr w:type="spellStart"/>
-            <w:r>
-              <w:t>c</w:t>
-            </w:r>
-            <w:r>
-              <w:t>.</w:t>
-            </w:r>
-            <w:r>
-              <w:t>Grower_c</w:t>
-            </w:r>
-            <w:proofErr w:type="spellEnd"/>
-            <w:r>
-              <w:t>}</w:t>
+            <w:pPr>
+              <w:rPr>
+                <w:lang w:val="en-US"/>
+              </w:rPr>
+            </w:pPr>
+            <w:r>
+              <w:t>{Haulage_Instruction__</w:t>
+            </w:r>
+            <w:proofErr w:type="gramStart"/>
+            <w:r>
+              <w:t>c.Grower</w:t>
+            </w:r>
+            <w:proofErr w:type="gramEnd"/>
+            <w:r>
+              <w:t>__c}</w:t>
             </w:r>
           </w:p>
         </w:tc>
@@ -1542,10 +1279,37 @@
             <w:tcW w:w="7988" w:type="dxa"/>
           </w:tcPr>
           <w:p>
+            <w:pPr>
+              <w:rPr>
+                <w:lang w:val="en-US"/>
+              </w:rPr>
+            </w:pPr>
             <w:r>
               <w:t>{</w:t>
             </w:r>
-            <w:proofErr w:type="spellStart"/>
+            <w:r>
+              <w:rPr>
+                <w:lang w:val="en-US"/>
+              </w:rPr>
+              <w:t>Haulage_Instruction__</w:t>
+            </w:r>
+            <w:proofErr w:type="gramStart"/>
+            <w:r>
+              <w:rPr>
+                <w:lang w:val="en-US"/>
+              </w:rPr>
+              <w:t>c.Contact</w:t>
+            </w:r>
+            <w:proofErr w:type="gramEnd"/>
+            <w:r>
+              <w:rPr>
+                <w:lang w:val="en-US"/>
+              </w:rPr>
+              <w:t>_Name__c</w:t>
+            </w:r>
+            <w:r>
+              <w:t>} {</w:t>
+            </w:r>
             <w:r>
               <w:t>Haulage_Instruction__c</w:t>
             </w:r>
@@ -1553,23 +1317,8 @@
               <w:t>.</w:t>
             </w:r>
             <w:r>
-              <w:t>Contact_Name__c</w:t>
-            </w:r>
-            <w:proofErr w:type="spellEnd"/>
-            <w:r>
-              <w:t>} {</w:t>
-            </w:r>
-            <w:proofErr w:type="spellStart"/>
-            <w:r>
-              <w:t>Haulage_Instruction__c</w:t>
-            </w:r>
-            <w:r>
-              <w:t>.</w:t>
-            </w:r>
-            <w:r>
               <w:t>Telephone__c</w:t>
             </w:r>
-            <w:proofErr w:type="spellEnd"/>
             <w:r>
               <w:t>}</w:t>
             </w:r>
@@ -1645,42 +1394,40 @@
               <w:t>{</w:t>
             </w:r>
             <w:r>
+              <w:t>Haulage_Instruction__</w:t>
+            </w:r>
+            <w:proofErr w:type="gramStart"/>
+            <w:r>
+              <w:t>c</w:t>
+            </w:r>
+            <w:r>
+              <w:t>.</w:t>
+            </w:r>
+            <w:r>
+              <w:t>Variety</w:t>
+            </w:r>
+            <w:proofErr w:type="gramEnd"/>
+            <w:r>
+              <w:t>__c</w:t>
+            </w:r>
+            <w:r>
+              <w:t>.Name</w:t>
+            </w:r>
+            <w:r>
+              <w:t>} {</w:t>
+            </w:r>
+            <w:r>
               <w:t>Haulage_Instruction__c</w:t>
             </w:r>
             <w:r>
               <w:t>.</w:t>
             </w:r>
             <w:r>
-              <w:t>Variety__</w:t>
-            </w:r>
-            <w:proofErr w:type="spellStart"/>
-            <w:r>
-              <w:t>c</w:t>
+              <w:t>Commodity__c</w:t>
             </w:r>
             <w:r>
               <w:t>.Name</w:t>
             </w:r>
-            <w:proofErr w:type="spellEnd"/>
-            <w:r>
-              <w:t>} {</w:t>
-            </w:r>
-            <w:r>
-              <w:t>Haulage_Instruction__c</w:t>
-            </w:r>
-            <w:r>
-              <w:t>.</w:t>
-            </w:r>
-            <w:r>
-              <w:t>Commodity__</w:t>
-            </w:r>
-            <w:proofErr w:type="spellStart"/>
-            <w:r>
-              <w:t>c</w:t>
-            </w:r>
-            <w:r>
-              <w:t>.Name</w:t>
-            </w:r>
-            <w:proofErr w:type="spellEnd"/>
             <w:r>
               <w:t>}</w:t>
             </w:r>
@@ -1712,12 +1459,18 @@
               </w:rPr>
               <w:t>{</w:t>
             </w:r>
-            <w:proofErr w:type="spellStart"/>
             <w:r>
               <w:rPr>
                 <w:bCs/>
               </w:rPr>
-              <w:t>Haulage_Instruction__c</w:t>
+              <w:t>Haulage_Instruction__</w:t>
+            </w:r>
+            <w:proofErr w:type="gramStart"/>
+            <w:r>
+              <w:rPr>
+                <w:bCs/>
+              </w:rPr>
+              <w:t>c</w:t>
             </w:r>
             <w:r>
               <w:rPr>
@@ -1729,9 +1482,15 @@
               <w:rPr>
                 <w:bCs/>
               </w:rPr>
-              <w:t>Tonnage__c</w:t>
-            </w:r>
-            <w:proofErr w:type="spellEnd"/>
+              <w:t>Tonnage</w:t>
+            </w:r>
+            <w:proofErr w:type="gramEnd"/>
+            <w:r>
+              <w:rPr>
+                <w:bCs/>
+              </w:rPr>
+              <w:t>__c</w:t>
+            </w:r>
             <w:r>
               <w:rPr>
                 <w:bCs/>
@@ -1757,8 +1516,8 @@
         <w:tblLook w:val="01E0" w:firstRow="1" w:lastRow="1" w:firstColumn="1" w:lastColumn="1" w:noHBand="0" w:noVBand="0"/>
       </w:tblPr>
       <w:tblGrid>
-        <w:gridCol w:w="2713"/>
-        <w:gridCol w:w="7743"/>
+        <w:gridCol w:w="2711"/>
+        <w:gridCol w:w="7745"/>
       </w:tblGrid>
       <w:tr>
         <w:trPr>
@@ -1779,23 +1538,34 @@
             <w:tcW w:w="7988" w:type="dxa"/>
           </w:tcPr>
           <w:p>
+            <w:pPr>
+              <w:rPr>
+                <w:lang w:val="en-US"/>
+              </w:rPr>
+            </w:pPr>
             <w:r>
               <w:t>{</w:t>
             </w:r>
             <w:r>
+              <w:rPr>
+                <w:lang w:val="en-US"/>
+              </w:rPr>
               <w:t>Haulage_Instruction__</w:t>
             </w:r>
-            <w:proofErr w:type="spellStart"/>
-            <w:r>
-              <w:t>c</w:t>
-            </w:r>
-            <w:r>
-              <w:t>.</w:t>
-            </w:r>
-            <w:r>
-              <w:t>Buyer_c</w:t>
-            </w:r>
-            <w:proofErr w:type="spellEnd"/>
+            <w:proofErr w:type="gramStart"/>
+            <w:r>
+              <w:rPr>
+                <w:lang w:val="en-US"/>
+              </w:rPr>
+              <w:t>c.Buyer</w:t>
+            </w:r>
+            <w:proofErr w:type="gramEnd"/>
+            <w:r>
+              <w:rPr>
+                <w:lang w:val="en-US"/>
+              </w:rPr>
+              <w:t>__c</w:t>
+            </w:r>
             <w:r>
               <w:t>}</w:t>
             </w:r>
@@ -1840,6 +1610,7 @@
             <w:pPr>
               <w:rPr>
                 <w:bCs/>
+                <w:lang w:val="en-US"/>
               </w:rPr>
             </w:pPr>
             <w:r>
@@ -1848,26 +1619,29 @@
               </w:rPr>
               <w:t>{</w:t>
             </w:r>
-            <w:proofErr w:type="spellStart"/>
             <w:r>
               <w:rPr>
                 <w:bCs/>
+                <w:lang w:val="en-US"/>
               </w:rPr>
-              <w:t>Delivery_Instruction__c</w:t>
-            </w:r>
+              <w:t>Delivery_Instruction__</w:t>
+            </w:r>
+            <w:proofErr w:type="gramStart"/>
             <w:r>
               <w:rPr>
                 <w:bCs/>
+                <w:lang w:val="en-US"/>
               </w:rPr>
-              <w:t>.</w:t>
-            </w:r>
+              <w:t>c.Delivery</w:t>
+            </w:r>
+            <w:proofErr w:type="gramEnd"/>
             <w:r>
               <w:rPr>
                 <w:bCs/>
+                <w:lang w:val="en-US"/>
               </w:rPr>
-              <w:t>Delivery_Reference_No__c</w:t>
-            </w:r>
-            <w:proofErr w:type="spellEnd"/>
+              <w:t>_Reference_No__c</w:t>
+            </w:r>
             <w:r>
               <w:rPr>
                 <w:bCs/>
@@ -1893,9 +1667,9 @@
         <w:tblLook w:val="01E0" w:firstRow="1" w:lastRow="1" w:firstColumn="1" w:lastColumn="1" w:noHBand="0" w:noVBand="0"/>
       </w:tblPr>
       <w:tblGrid>
-        <w:gridCol w:w="2717"/>
-        <w:gridCol w:w="1955"/>
-        <w:gridCol w:w="5784"/>
+        <w:gridCol w:w="3552"/>
+        <w:gridCol w:w="1588"/>
+        <w:gridCol w:w="5316"/>
       </w:tblGrid>
       <w:tr>
         <w:tc>
@@ -1934,7 +1708,7 @@
           </w:tcPr>
           <w:p>
             <w:r>
-              <w:t>{#delivery_dates}</w:t>
+              <w:t>{#haulage_instruction_delivery_rows}</w:t>
             </w:r>
           </w:p>
         </w:tc>
@@ -1949,41 +1723,28 @@
               </w:rPr>
             </w:pPr>
             <w:r>
+              <w:t>{delivery_date}</w:t>
+            </w:r>
+          </w:p>
+        </w:tc>
+        <w:tc>
+          <w:tcPr>
+            <w:tcW w:w="6008" w:type="dxa"/>
+          </w:tcPr>
+          <w:p>
+            <w:r>
+              <w:t>{booking_</w:t>
+            </w:r>
+            <w:proofErr w:type="gramStart"/>
+            <w:r>
+              <w:t>reference}</w:t>
+            </w:r>
+            <w:r>
               <w:t>{</w:t>
             </w:r>
-            <w:proofErr w:type="spellStart"/>
-            <w:r>
-              <w:t>delivery_date</w:t>
-            </w:r>
-            <w:proofErr w:type="spellEnd"/>
-            <w:r>
-              <w:t>}</w:t>
-            </w:r>
-          </w:p>
-        </w:tc>
-        <w:tc>
-          <w:tcPr>
-            <w:tcW w:w="6008" w:type="dxa"/>
-          </w:tcPr>
-          <w:p>
-            <w:r>
-              <w:t>{</w:t>
-            </w:r>
-            <w:proofErr w:type="spellStart"/>
-            <w:r>
-              <w:t>booking_reference</w:t>
-            </w:r>
-            <w:proofErr w:type="spellEnd"/>
-            <w:r>
-              <w:t>}{/</w:t>
-            </w:r>
-            <w:proofErr w:type="spellStart"/>
-            <w:r>
-              <w:t>delivery_dates</w:t>
-            </w:r>
-            <w:proofErr w:type="spellEnd"/>
-            <w:r>
-              <w:t>}</w:t>
+            <w:proofErr w:type="gramEnd"/>
+            <w:r>
+              <w:t>/haulage_instruction_delivery_rows}</w:t>
             </w:r>
           </w:p>
         </w:tc>
@@ -2044,17 +1805,23 @@
             <w:r>
               <w:t>{</w:t>
             </w:r>
-            <w:proofErr w:type="spellStart"/>
-            <w:r>
-              <w:t>Haulage_Instruction__c</w:t>
+            <w:r>
+              <w:t>Haulage_Instruction__</w:t>
+            </w:r>
+            <w:proofErr w:type="gramStart"/>
+            <w:r>
+              <w:t>c</w:t>
             </w:r>
             <w:r>
               <w:t>.</w:t>
             </w:r>
             <w:r>
-              <w:t>Haulage_Rate__c</w:t>
-            </w:r>
-            <w:proofErr w:type="spellEnd"/>
+              <w:t>Haulage</w:t>
+            </w:r>
+            <w:proofErr w:type="gramEnd"/>
+            <w:r>
+              <w:t>_Rate__c</w:t>
+            </w:r>
             <w:r>
               <w:t>}</w:t>
             </w:r>
@@ -2097,7 +1864,15 @@
           </w:tcPr>
           <w:p>
             <w:r>
-              <w:t>Checked by:- Initials</w:t>
+              <w:t xml:space="preserve">Checked </w:t>
+            </w:r>
+            <w:proofErr w:type="gramStart"/>
+            <w:r>
+              <w:t>by:-</w:t>
+            </w:r>
+            <w:proofErr w:type="gramEnd"/>
+            <w:r>
+              <w:t xml:space="preserve"> Initials</w:t>
             </w:r>
           </w:p>
         </w:tc>
@@ -3205,7 +2980,6 @@
   <w:style w:type="character" w:default="1" w:styleId="DefaultParagraphFont">
     <w:name w:val="Default Paragraph Font"/>
     <w:uiPriority w:val="1"/>
-    <w:semiHidden/>
     <w:unhideWhenUsed/>
   </w:style>
   <w:style w:type="table" w:default="1" w:styleId="TableNormal">

</xml_diff>

<commit_message>
update mapping of sum variables
</commit_message>
<xml_diff>
--- a/src/templates/template_Haulage_Instruction.docx
+++ b/src/templates/template_Haulage_Instruction.docx
@@ -18,6 +18,185 @@
       </w:pPr>
       <w:r>
         <w:rPr>
+          <w:noProof/>
+        </w:rPr>
+        <mc:AlternateContent>
+          <mc:Choice Requires="wps">
+            <w:drawing>
+              <wp:anchor distT="0" distB="0" distL="114300" distR="114300" simplePos="0" relativeHeight="251659264" behindDoc="0" locked="0" layoutInCell="1" allowOverlap="1" wp14:anchorId="328FD266" wp14:editId="0C06AED3">
+                <wp:simplePos x="0" y="0"/>
+                <wp:positionH relativeFrom="column">
+                  <wp:posOffset>-9525</wp:posOffset>
+                </wp:positionH>
+                <wp:positionV relativeFrom="paragraph">
+                  <wp:posOffset>-259715</wp:posOffset>
+                </wp:positionV>
+                <wp:extent cx="3895725" cy="1638300"/>
+                <wp:effectExtent l="0" t="0" r="0" b="0"/>
+                <wp:wrapNone/>
+                <wp:docPr id="4" name="Text Box 4"/>
+                <wp:cNvGraphicFramePr/>
+                <a:graphic xmlns:a="http://schemas.openxmlformats.org/drawingml/2006/main">
+                  <a:graphicData uri="http://schemas.microsoft.com/office/word/2010/wordprocessingShape">
+                    <wps:wsp>
+                      <wps:cNvSpPr txBox="1"/>
+                      <wps:spPr>
+                        <a:xfrm>
+                          <a:off x="0" y="0"/>
+                          <a:ext cx="3895725" cy="1638300"/>
+                        </a:xfrm>
+                        <a:prstGeom prst="rect">
+                          <a:avLst/>
+                        </a:prstGeom>
+                        <a:noFill/>
+                        <a:ln>
+                          <a:noFill/>
+                        </a:ln>
+                      </wps:spPr>
+                      <wps:style>
+                        <a:lnRef idx="0">
+                          <a:scrgbClr r="0" g="0" b="0"/>
+                        </a:lnRef>
+                        <a:fillRef idx="0">
+                          <a:scrgbClr r="0" g="0" b="0"/>
+                        </a:fillRef>
+                        <a:effectRef idx="0">
+                          <a:scrgbClr r="0" g="0" b="0"/>
+                        </a:effectRef>
+                        <a:fontRef idx="minor">
+                          <a:schemeClr val="dk1"/>
+                        </a:fontRef>
+                      </wps:style>
+                      <wps:txbx>
+                        <w:txbxContent>
+                          <w:p>
+                            <w:r>
+                              <w:t>{#header_</w:t>
+                            </w:r>
+                            <w:proofErr w:type="gramStart"/>
+                            <w:r>
+                              <w:t>show}{</w:t>
+                            </w:r>
+                            <w:proofErr w:type="gramEnd"/>
+                            <w:r>
+                              <w:t>#header_logo_only}</w:t>
+                            </w:r>
+                            <w:r>
+                              <w:t>{%header_logo}</w:t>
+                            </w:r>
+                            <w:r>
+                              <w:t>{</w:t>
+                            </w:r>
+                            <w:r>
+                              <w:rPr>
+                                <w:lang w:val="en-US"/>
+                              </w:rPr>
+                              <w:t>/</w:t>
+                            </w:r>
+                            <w:proofErr w:type="spellStart"/>
+                            <w:r>
+                              <w:rPr>
+                                <w:lang w:val="en-US"/>
+                              </w:rPr>
+                              <w:t>header_logo_only</w:t>
+                            </w:r>
+                            <w:proofErr w:type="spellEnd"/>
+                            <w:r>
+                              <w:t>}</w:t>
+                            </w:r>
+                            <w:r>
+                              <w:t>{#header_show_full}</w:t>
+                            </w:r>
+                            <w:r>
+                              <w:t>{%header_logo}</w:t>
+                            </w:r>
+                            <w:r>
+                              <w:t>{/header_show_full}{/header_show}</w:t>
+                            </w:r>
+                          </w:p>
+                        </w:txbxContent>
+                      </wps:txbx>
+                      <wps:bodyPr rot="0" spcFirstLastPara="0" vertOverflow="overflow" horzOverflow="overflow" vert="horz" wrap="square" lIns="91440" tIns="45720" rIns="91440" bIns="45720" numCol="1" spcCol="0" rtlCol="0" fromWordArt="0" anchor="t" anchorCtr="0" forceAA="0" compatLnSpc="1">
+                        <a:prstTxWarp prst="textNoShape">
+                          <a:avLst/>
+                        </a:prstTxWarp>
+                        <a:noAutofit/>
+                      </wps:bodyPr>
+                    </wps:wsp>
+                  </a:graphicData>
+                </a:graphic>
+                <wp14:sizeRelH relativeFrom="margin">
+                  <wp14:pctWidth>0</wp14:pctWidth>
+                </wp14:sizeRelH>
+                <wp14:sizeRelV relativeFrom="margin">
+                  <wp14:pctHeight>0</wp14:pctHeight>
+                </wp14:sizeRelV>
+              </wp:anchor>
+            </w:drawing>
+          </mc:Choice>
+          <mc:Fallback>
+            <w:pict>
+              <v:shapetype w14:anchorId="328FD266" id="_x0000_t202" coordsize="21600,21600" o:spt="202" path="m,l,21600r21600,l21600,xe">
+                <v:stroke joinstyle="miter"/>
+                <v:path gradientshapeok="t" o:connecttype="rect"/>
+              </v:shapetype>
+              <v:shape id="Text Box 4" o:spid="_x0000_s1026" type="#_x0000_t202" style="position:absolute;margin-left:-.75pt;margin-top:-20.45pt;width:306.75pt;height:129pt;z-index:251659264;visibility:visible;mso-wrap-style:square;mso-width-percent:0;mso-height-percent:0;mso-wrap-distance-left:9pt;mso-wrap-distance-top:0;mso-wrap-distance-right:9pt;mso-wrap-distance-bottom:0;mso-position-horizontal:absolute;mso-position-horizontal-relative:text;mso-position-vertical:absolute;mso-position-vertical-relative:text;mso-width-percent:0;mso-height-percent:0;mso-width-relative:margin;mso-height-relative:margin;v-text-anchor:top" o:gfxdata="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" filled="f" stroked="f">
+                <v:textbox>
+                  <w:txbxContent>
+                    <w:p>
+                      <w:r>
+                        <w:t>{#header_</w:t>
+                      </w:r>
+                      <w:proofErr w:type="gramStart"/>
+                      <w:r>
+                        <w:t>show}{</w:t>
+                      </w:r>
+                      <w:proofErr w:type="gramEnd"/>
+                      <w:r>
+                        <w:t>#header_logo_only}</w:t>
+                      </w:r>
+                      <w:r>
+                        <w:t>{%header_logo}</w:t>
+                      </w:r>
+                      <w:r>
+                        <w:t>{</w:t>
+                      </w:r>
+                      <w:r>
+                        <w:rPr>
+                          <w:lang w:val="en-US"/>
+                        </w:rPr>
+                        <w:t>/</w:t>
+                      </w:r>
+                      <w:proofErr w:type="spellStart"/>
+                      <w:r>
+                        <w:rPr>
+                          <w:lang w:val="en-US"/>
+                        </w:rPr>
+                        <w:t>header_logo_only</w:t>
+                      </w:r>
+                      <w:proofErr w:type="spellEnd"/>
+                      <w:r>
+                        <w:t>}</w:t>
+                      </w:r>
+                      <w:r>
+                        <w:t>{#header_show_full}</w:t>
+                      </w:r>
+                      <w:r>
+                        <w:t>{%header_logo}</w:t>
+                      </w:r>
+                      <w:r>
+                        <w:t>{/header_show_full}{/header_show}</w:t>
+                      </w:r>
+                    </w:p>
+                  </w:txbxContent>
+                </v:textbox>
+              </v:shape>
+            </w:pict>
+          </mc:Fallback>
+        </mc:AlternateContent>
+      </w:r>
+      <w:r>
+        <w:rPr>
           <w:b/>
           <w:bCs/>
           <w:noProof/>
@@ -27,7 +206,7 @@
         <mc:AlternateContent>
           <mc:Choice Requires="wps">
             <w:drawing>
-              <wp:anchor distT="0" distB="0" distL="114300" distR="114300" simplePos="0" relativeHeight="251660288" behindDoc="0" locked="0" layoutInCell="1" allowOverlap="1" wp14:anchorId="1DB04DF8" wp14:editId="5EB12EBF">
+              <wp:anchor distT="0" distB="0" distL="114300" distR="114300" simplePos="0" relativeHeight="251660288" behindDoc="0" locked="0" layoutInCell="1" allowOverlap="1" wp14:anchorId="1DB04DF8" wp14:editId="53FB71D2">
                 <wp:simplePos x="0" y="0"/>
                 <wp:positionH relativeFrom="column">
                   <wp:posOffset>1809750</wp:posOffset>
@@ -100,12 +279,14 @@
                               </w:rPr>
                               <w:t>/</w:t>
                             </w:r>
+                            <w:proofErr w:type="spellStart"/>
                             <w:r>
                               <w:rPr>
                                 <w:lang w:val="en-US"/>
                               </w:rPr>
                               <w:t>header_logo_only</w:t>
                             </w:r>
+                            <w:proofErr w:type="spellEnd"/>
                             <w:r>
                               <w:t>}</w:t>
                             </w:r>
@@ -139,7 +320,23 @@
                                 <w:sz w:val="14"/>
                                 <w:szCs w:val="14"/>
                               </w:rPr>
-                              <w:t>{company_info_organization_name}</w:t>
+                              <w:t>{</w:t>
+                            </w:r>
+                            <w:proofErr w:type="spellStart"/>
+                            <w:r>
+                              <w:rPr>
+                                <w:sz w:val="14"/>
+                                <w:szCs w:val="14"/>
+                              </w:rPr>
+                              <w:t>company_info_organization_name</w:t>
+                            </w:r>
+                            <w:proofErr w:type="spellEnd"/>
+                            <w:r>
+                              <w:rPr>
+                                <w:sz w:val="14"/>
+                                <w:szCs w:val="14"/>
+                              </w:rPr>
+                              <w:t>}</w:t>
                             </w:r>
                           </w:p>
                           <w:p>
@@ -155,7 +352,25 @@
                                 <w:szCs w:val="14"/>
                                 <w:lang w:val="en-US"/>
                               </w:rPr>
-                              <w:t>{company_info_address}</w:t>
+                              <w:t>{</w:t>
+                            </w:r>
+                            <w:proofErr w:type="spellStart"/>
+                            <w:r>
+                              <w:rPr>
+                                <w:sz w:val="14"/>
+                                <w:szCs w:val="14"/>
+                                <w:lang w:val="en-US"/>
+                              </w:rPr>
+                              <w:t>company_info_address</w:t>
+                            </w:r>
+                            <w:proofErr w:type="spellEnd"/>
+                            <w:r>
+                              <w:rPr>
+                                <w:sz w:val="14"/>
+                                <w:szCs w:val="14"/>
+                                <w:lang w:val="en-US"/>
+                              </w:rPr>
+                              <w:t>}</w:t>
                             </w:r>
                           </w:p>
                           <w:p>
@@ -173,7 +388,25 @@
                                 <w:szCs w:val="14"/>
                                 <w:lang w:val="en-US"/>
                               </w:rPr>
-                              <w:t>{company_info_postcode}</w:t>
+                              <w:t>{</w:t>
+                            </w:r>
+                            <w:proofErr w:type="spellStart"/>
+                            <w:r>
+                              <w:rPr>
+                                <w:sz w:val="14"/>
+                                <w:szCs w:val="14"/>
+                                <w:lang w:val="en-US"/>
+                              </w:rPr>
+                              <w:t>company_info_postcode</w:t>
+                            </w:r>
+                            <w:proofErr w:type="spellEnd"/>
+                            <w:r>
+                              <w:rPr>
+                                <w:sz w:val="14"/>
+                                <w:szCs w:val="14"/>
+                                <w:lang w:val="en-US"/>
+                              </w:rPr>
+                              <w:t>}</w:t>
                             </w:r>
                           </w:p>
                           <w:p>
@@ -219,7 +452,25 @@
                                 <w:szCs w:val="14"/>
                                 <w:lang w:val="en-US"/>
                               </w:rPr>
-                              <w:t>{company_info_telephone}</w:t>
+                              <w:t>{</w:t>
+                            </w:r>
+                            <w:proofErr w:type="spellStart"/>
+                            <w:r>
+                              <w:rPr>
+                                <w:sz w:val="14"/>
+                                <w:szCs w:val="14"/>
+                                <w:lang w:val="en-US"/>
+                              </w:rPr>
+                              <w:t>company_info_telephone</w:t>
+                            </w:r>
+                            <w:proofErr w:type="spellEnd"/>
+                            <w:r>
+                              <w:rPr>
+                                <w:sz w:val="14"/>
+                                <w:szCs w:val="14"/>
+                                <w:lang w:val="en-US"/>
+                              </w:rPr>
+                              <w:t>}</w:t>
                             </w:r>
                           </w:p>
                           <w:p>
@@ -254,7 +505,25 @@
                                 <w:szCs w:val="14"/>
                                 <w:lang w:val="en-US"/>
                               </w:rPr>
-                              <w:t>{company_info_fax}</w:t>
+                              <w:t>{</w:t>
+                            </w:r>
+                            <w:proofErr w:type="spellStart"/>
+                            <w:r>
+                              <w:rPr>
+                                <w:sz w:val="14"/>
+                                <w:szCs w:val="14"/>
+                                <w:lang w:val="en-US"/>
+                              </w:rPr>
+                              <w:t>company_info_fax</w:t>
+                            </w:r>
+                            <w:proofErr w:type="spellEnd"/>
+                            <w:r>
+                              <w:rPr>
+                                <w:sz w:val="14"/>
+                                <w:szCs w:val="14"/>
+                                <w:lang w:val="en-US"/>
+                              </w:rPr>
+                              <w:t>}</w:t>
                             </w:r>
                           </w:p>
                           <w:p>
@@ -300,7 +569,25 @@
                                 <w:szCs w:val="14"/>
                                 <w:lang w:val="en-US"/>
                               </w:rPr>
-                              <w:t>{company_info_email}</w:t>
+                              <w:t>{</w:t>
+                            </w:r>
+                            <w:proofErr w:type="spellStart"/>
+                            <w:r>
+                              <w:rPr>
+                                <w:sz w:val="14"/>
+                                <w:szCs w:val="14"/>
+                                <w:lang w:val="en-US"/>
+                              </w:rPr>
+                              <w:t>company_info_email</w:t>
+                            </w:r>
+                            <w:proofErr w:type="spellEnd"/>
+                            <w:r>
+                              <w:rPr>
+                                <w:sz w:val="14"/>
+                                <w:szCs w:val="14"/>
+                                <w:lang w:val="en-US"/>
+                              </w:rPr>
+                              <w:t>}</w:t>
                             </w:r>
                           </w:p>
                           <w:p>
@@ -326,7 +613,25 @@
                                 <w:szCs w:val="14"/>
                                 <w:lang w:val="en-US"/>
                               </w:rPr>
-                              <w:t>{company_info_web}</w:t>
+                              <w:t>{</w:t>
+                            </w:r>
+                            <w:proofErr w:type="spellStart"/>
+                            <w:r>
+                              <w:rPr>
+                                <w:sz w:val="14"/>
+                                <w:szCs w:val="14"/>
+                                <w:lang w:val="en-US"/>
+                              </w:rPr>
+                              <w:t>company_info_web</w:t>
+                            </w:r>
+                            <w:proofErr w:type="spellEnd"/>
+                            <w:r>
+                              <w:rPr>
+                                <w:sz w:val="14"/>
+                                <w:szCs w:val="14"/>
+                                <w:lang w:val="en-US"/>
+                              </w:rPr>
+                              <w:t>}</w:t>
                             </w:r>
                             <w:r>
                               <w:rPr>
@@ -362,7 +667,25 @@
                                 <w:szCs w:val="14"/>
                                 <w:lang w:val="en-US"/>
                               </w:rPr>
-                              <w:t>{/header_show_full}</w:t>
+                              <w:t>{/</w:t>
+                            </w:r>
+                            <w:proofErr w:type="spellStart"/>
+                            <w:r>
+                              <w:rPr>
+                                <w:sz w:val="14"/>
+                                <w:szCs w:val="14"/>
+                                <w:lang w:val="en-US"/>
+                              </w:rPr>
+                              <w:t>header_show_full</w:t>
+                            </w:r>
+                            <w:proofErr w:type="spellEnd"/>
+                            <w:r>
+                              <w:rPr>
+                                <w:sz w:val="14"/>
+                                <w:szCs w:val="14"/>
+                                <w:lang w:val="en-US"/>
+                              </w:rPr>
+                              <w:t>}</w:t>
                             </w:r>
                           </w:p>
                           <w:p>
@@ -380,7 +703,25 @@
                                 <w:szCs w:val="14"/>
                                 <w:lang w:val="en-US"/>
                               </w:rPr>
-                              <w:t>{/header_show}</w:t>
+                              <w:t>{/</w:t>
+                            </w:r>
+                            <w:proofErr w:type="spellStart"/>
+                            <w:r>
+                              <w:rPr>
+                                <w:sz w:val="14"/>
+                                <w:szCs w:val="14"/>
+                                <w:lang w:val="en-US"/>
+                              </w:rPr>
+                              <w:t>header_show</w:t>
+                            </w:r>
+                            <w:proofErr w:type="spellEnd"/>
+                            <w:r>
+                              <w:rPr>
+                                <w:sz w:val="14"/>
+                                <w:szCs w:val="14"/>
+                                <w:lang w:val="en-US"/>
+                              </w:rPr>
+                              <w:t>}</w:t>
                             </w:r>
                           </w:p>
                           <w:p>
@@ -410,11 +751,7 @@
           </mc:Choice>
           <mc:Fallback>
             <w:pict>
-              <v:shapetype w14:anchorId="1DB04DF8" id="_x0000_t202" coordsize="21600,21600" o:spt="202" path="m,l,21600r21600,l21600,xe">
-                <v:stroke joinstyle="miter"/>
-                <v:path gradientshapeok="t" o:connecttype="rect"/>
-              </v:shapetype>
-              <v:shape id="Text Box 5" o:spid="_x0000_s1026" type="#_x0000_t202" style="position:absolute;margin-left:142.5pt;margin-top:-19.9pt;width:385.5pt;height:144.75pt;z-index:251660288;visibility:visible;mso-wrap-style:square;mso-width-percent:0;mso-wrap-distance-left:9pt;mso-wrap-distance-top:0;mso-wrap-distance-right:9pt;mso-wrap-distance-bottom:0;mso-position-horizontal:absolute;mso-position-horizontal-relative:text;mso-position-vertical:absolute;mso-position-vertical-relative:text;mso-width-percent:0;mso-width-relative:margin;v-text-anchor:top" o:gfxdata="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" filled="f" stroked="f">
+              <v:shape w14:anchorId="1DB04DF8" id="Text Box 5" o:spid="_x0000_s1027" type="#_x0000_t202" style="position:absolute;margin-left:142.5pt;margin-top:-19.9pt;width:385.5pt;height:144.75pt;z-index:251660288;visibility:visible;mso-wrap-style:square;mso-width-percent:0;mso-wrap-distance-left:9pt;mso-wrap-distance-top:0;mso-wrap-distance-right:9pt;mso-wrap-distance-bottom:0;mso-position-horizontal:absolute;mso-position-horizontal-relative:text;mso-position-vertical:absolute;mso-position-vertical-relative:text;mso-width-percent:0;mso-width-relative:margin;v-text-anchor:top" o:gfxdata="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" filled="f" stroked="f">
                 <v:textbox>
                   <w:txbxContent>
                     <w:p>
@@ -444,12 +781,14 @@
                         </w:rPr>
                         <w:t>/</w:t>
                       </w:r>
+                      <w:proofErr w:type="spellStart"/>
                       <w:r>
                         <w:rPr>
                           <w:lang w:val="en-US"/>
                         </w:rPr>
                         <w:t>header_logo_only</w:t>
                       </w:r>
+                      <w:proofErr w:type="spellEnd"/>
                       <w:r>
                         <w:t>}</w:t>
                       </w:r>
@@ -483,7 +822,23 @@
                           <w:sz w:val="14"/>
                           <w:szCs w:val="14"/>
                         </w:rPr>
-                        <w:t>{company_info_organization_name}</w:t>
+                        <w:t>{</w:t>
+                      </w:r>
+                      <w:proofErr w:type="spellStart"/>
+                      <w:r>
+                        <w:rPr>
+                          <w:sz w:val="14"/>
+                          <w:szCs w:val="14"/>
+                        </w:rPr>
+                        <w:t>company_info_organization_name</w:t>
+                      </w:r>
+                      <w:proofErr w:type="spellEnd"/>
+                      <w:r>
+                        <w:rPr>
+                          <w:sz w:val="14"/>
+                          <w:szCs w:val="14"/>
+                        </w:rPr>
+                        <w:t>}</w:t>
                       </w:r>
                     </w:p>
                     <w:p>
@@ -499,7 +854,25 @@
                           <w:szCs w:val="14"/>
                           <w:lang w:val="en-US"/>
                         </w:rPr>
-                        <w:t>{company_info_address}</w:t>
+                        <w:t>{</w:t>
+                      </w:r>
+                      <w:proofErr w:type="spellStart"/>
+                      <w:r>
+                        <w:rPr>
+                          <w:sz w:val="14"/>
+                          <w:szCs w:val="14"/>
+                          <w:lang w:val="en-US"/>
+                        </w:rPr>
+                        <w:t>company_info_address</w:t>
+                      </w:r>
+                      <w:proofErr w:type="spellEnd"/>
+                      <w:r>
+                        <w:rPr>
+                          <w:sz w:val="14"/>
+                          <w:szCs w:val="14"/>
+                          <w:lang w:val="en-US"/>
+                        </w:rPr>
+                        <w:t>}</w:t>
                       </w:r>
                     </w:p>
                     <w:p>
@@ -517,7 +890,25 @@
                           <w:szCs w:val="14"/>
                           <w:lang w:val="en-US"/>
                         </w:rPr>
-                        <w:t>{company_info_postcode}</w:t>
+                        <w:t>{</w:t>
+                      </w:r>
+                      <w:proofErr w:type="spellStart"/>
+                      <w:r>
+                        <w:rPr>
+                          <w:sz w:val="14"/>
+                          <w:szCs w:val="14"/>
+                          <w:lang w:val="en-US"/>
+                        </w:rPr>
+                        <w:t>company_info_postcode</w:t>
+                      </w:r>
+                      <w:proofErr w:type="spellEnd"/>
+                      <w:r>
+                        <w:rPr>
+                          <w:sz w:val="14"/>
+                          <w:szCs w:val="14"/>
+                          <w:lang w:val="en-US"/>
+                        </w:rPr>
+                        <w:t>}</w:t>
                       </w:r>
                     </w:p>
                     <w:p>
@@ -563,7 +954,25 @@
                           <w:szCs w:val="14"/>
                           <w:lang w:val="en-US"/>
                         </w:rPr>
-                        <w:t>{company_info_telephone}</w:t>
+                        <w:t>{</w:t>
+                      </w:r>
+                      <w:proofErr w:type="spellStart"/>
+                      <w:r>
+                        <w:rPr>
+                          <w:sz w:val="14"/>
+                          <w:szCs w:val="14"/>
+                          <w:lang w:val="en-US"/>
+                        </w:rPr>
+                        <w:t>company_info_telephone</w:t>
+                      </w:r>
+                      <w:proofErr w:type="spellEnd"/>
+                      <w:r>
+                        <w:rPr>
+                          <w:sz w:val="14"/>
+                          <w:szCs w:val="14"/>
+                          <w:lang w:val="en-US"/>
+                        </w:rPr>
+                        <w:t>}</w:t>
                       </w:r>
                     </w:p>
                     <w:p>
@@ -598,7 +1007,25 @@
                           <w:szCs w:val="14"/>
                           <w:lang w:val="en-US"/>
                         </w:rPr>
-                        <w:t>{company_info_fax}</w:t>
+                        <w:t>{</w:t>
+                      </w:r>
+                      <w:proofErr w:type="spellStart"/>
+                      <w:r>
+                        <w:rPr>
+                          <w:sz w:val="14"/>
+                          <w:szCs w:val="14"/>
+                          <w:lang w:val="en-US"/>
+                        </w:rPr>
+                        <w:t>company_info_fax</w:t>
+                      </w:r>
+                      <w:proofErr w:type="spellEnd"/>
+                      <w:r>
+                        <w:rPr>
+                          <w:sz w:val="14"/>
+                          <w:szCs w:val="14"/>
+                          <w:lang w:val="en-US"/>
+                        </w:rPr>
+                        <w:t>}</w:t>
                       </w:r>
                     </w:p>
                     <w:p>
@@ -644,7 +1071,25 @@
                           <w:szCs w:val="14"/>
                           <w:lang w:val="en-US"/>
                         </w:rPr>
-                        <w:t>{company_info_email}</w:t>
+                        <w:t>{</w:t>
+                      </w:r>
+                      <w:proofErr w:type="spellStart"/>
+                      <w:r>
+                        <w:rPr>
+                          <w:sz w:val="14"/>
+                          <w:szCs w:val="14"/>
+                          <w:lang w:val="en-US"/>
+                        </w:rPr>
+                        <w:t>company_info_email</w:t>
+                      </w:r>
+                      <w:proofErr w:type="spellEnd"/>
+                      <w:r>
+                        <w:rPr>
+                          <w:sz w:val="14"/>
+                          <w:szCs w:val="14"/>
+                          <w:lang w:val="en-US"/>
+                        </w:rPr>
+                        <w:t>}</w:t>
                       </w:r>
                     </w:p>
                     <w:p>
@@ -670,7 +1115,25 @@
                           <w:szCs w:val="14"/>
                           <w:lang w:val="en-US"/>
                         </w:rPr>
-                        <w:t>{company_info_web}</w:t>
+                        <w:t>{</w:t>
+                      </w:r>
+                      <w:proofErr w:type="spellStart"/>
+                      <w:r>
+                        <w:rPr>
+                          <w:sz w:val="14"/>
+                          <w:szCs w:val="14"/>
+                          <w:lang w:val="en-US"/>
+                        </w:rPr>
+                        <w:t>company_info_web</w:t>
+                      </w:r>
+                      <w:proofErr w:type="spellEnd"/>
+                      <w:r>
+                        <w:rPr>
+                          <w:sz w:val="14"/>
+                          <w:szCs w:val="14"/>
+                          <w:lang w:val="en-US"/>
+                        </w:rPr>
+                        <w:t>}</w:t>
                       </w:r>
                       <w:r>
                         <w:rPr>
@@ -706,7 +1169,25 @@
                           <w:szCs w:val="14"/>
                           <w:lang w:val="en-US"/>
                         </w:rPr>
-                        <w:t>{/header_show_full}</w:t>
+                        <w:t>{/</w:t>
+                      </w:r>
+                      <w:proofErr w:type="spellStart"/>
+                      <w:r>
+                        <w:rPr>
+                          <w:sz w:val="14"/>
+                          <w:szCs w:val="14"/>
+                          <w:lang w:val="en-US"/>
+                        </w:rPr>
+                        <w:t>header_show_full</w:t>
+                      </w:r>
+                      <w:proofErr w:type="spellEnd"/>
+                      <w:r>
+                        <w:rPr>
+                          <w:sz w:val="14"/>
+                          <w:szCs w:val="14"/>
+                          <w:lang w:val="en-US"/>
+                        </w:rPr>
+                        <w:t>}</w:t>
                       </w:r>
                     </w:p>
                     <w:p>
@@ -724,7 +1205,25 @@
                           <w:szCs w:val="14"/>
                           <w:lang w:val="en-US"/>
                         </w:rPr>
-                        <w:t>{/header_show}</w:t>
+                        <w:t>{/</w:t>
+                      </w:r>
+                      <w:proofErr w:type="spellStart"/>
+                      <w:r>
+                        <w:rPr>
+                          <w:sz w:val="14"/>
+                          <w:szCs w:val="14"/>
+                          <w:lang w:val="en-US"/>
+                        </w:rPr>
+                        <w:t>header_show</w:t>
+                      </w:r>
+                      <w:proofErr w:type="spellEnd"/>
+                      <w:r>
+                        <w:rPr>
+                          <w:sz w:val="14"/>
+                          <w:szCs w:val="14"/>
+                          <w:lang w:val="en-US"/>
+                        </w:rPr>
+                        <w:t>}</w:t>
                       </w:r>
                     </w:p>
                     <w:p>
@@ -734,179 +1233,6 @@
                           <w:lang w:val="en-US"/>
                         </w:rPr>
                       </w:pPr>
-                    </w:p>
-                  </w:txbxContent>
-                </v:textbox>
-              </v:shape>
-            </w:pict>
-          </mc:Fallback>
-        </mc:AlternateContent>
-      </w:r>
-      <w:r>
-        <w:rPr>
-          <w:noProof/>
-        </w:rPr>
-        <mc:AlternateContent>
-          <mc:Choice Requires="wps">
-            <w:drawing>
-              <wp:anchor distT="0" distB="0" distL="114300" distR="114300" simplePos="0" relativeHeight="251659264" behindDoc="0" locked="0" layoutInCell="1" allowOverlap="1" wp14:anchorId="328FD266" wp14:editId="6676EB2E">
-                <wp:simplePos x="0" y="0"/>
-                <wp:positionH relativeFrom="column">
-                  <wp:posOffset>-257175</wp:posOffset>
-                </wp:positionH>
-                <wp:positionV relativeFrom="paragraph">
-                  <wp:posOffset>-259715</wp:posOffset>
-                </wp:positionV>
-                <wp:extent cx="3895725" cy="1638300"/>
-                <wp:effectExtent l="0" t="0" r="0" b="0"/>
-                <wp:wrapNone/>
-                <wp:docPr id="4" name="Text Box 4"/>
-                <wp:cNvGraphicFramePr/>
-                <a:graphic xmlns:a="http://schemas.openxmlformats.org/drawingml/2006/main">
-                  <a:graphicData uri="http://schemas.microsoft.com/office/word/2010/wordprocessingShape">
-                    <wps:wsp>
-                      <wps:cNvSpPr txBox="1"/>
-                      <wps:spPr>
-                        <a:xfrm>
-                          <a:off x="0" y="0"/>
-                          <a:ext cx="3895725" cy="1638300"/>
-                        </a:xfrm>
-                        <a:prstGeom prst="rect">
-                          <a:avLst/>
-                        </a:prstGeom>
-                        <a:noFill/>
-                        <a:ln>
-                          <a:noFill/>
-                        </a:ln>
-                      </wps:spPr>
-                      <wps:style>
-                        <a:lnRef idx="0">
-                          <a:scrgbClr r="0" g="0" b="0"/>
-                        </a:lnRef>
-                        <a:fillRef idx="0">
-                          <a:scrgbClr r="0" g="0" b="0"/>
-                        </a:fillRef>
-                        <a:effectRef idx="0">
-                          <a:scrgbClr r="0" g="0" b="0"/>
-                        </a:effectRef>
-                        <a:fontRef idx="minor">
-                          <a:schemeClr val="dk1"/>
-                        </a:fontRef>
-                      </wps:style>
-                      <wps:txbx>
-                        <w:txbxContent>
-                          <w:p>
-                            <w:r>
-                              <w:t>{#header_</w:t>
-                            </w:r>
-                            <w:proofErr w:type="gramStart"/>
-                            <w:r>
-                              <w:t>show}{</w:t>
-                            </w:r>
-                            <w:proofErr w:type="gramEnd"/>
-                            <w:r>
-                              <w:t>#header_logo_only}</w:t>
-                            </w:r>
-                            <w:r>
-                              <w:t>{%header_logo}</w:t>
-                            </w:r>
-                            <w:r>
-                              <w:t>{</w:t>
-                            </w:r>
-                            <w:r>
-                              <w:rPr>
-                                <w:lang w:val="en-US"/>
-                              </w:rPr>
-                              <w:t>/</w:t>
-                            </w:r>
-                            <w:r>
-                              <w:rPr>
-                                <w:lang w:val="en-US"/>
-                              </w:rPr>
-                              <w:t>header_logo_only</w:t>
-                            </w:r>
-                            <w:r>
-                              <w:t>}</w:t>
-                            </w:r>
-                            <w:r>
-                              <w:t>{#header_show_full}</w:t>
-                            </w:r>
-                            <w:r>
-                              <w:t>{%header_logo}</w:t>
-                            </w:r>
-                            <w:r>
-                              <w:t>{/header_show_full}{/header_show}</w:t>
-                            </w:r>
-                          </w:p>
-                        </w:txbxContent>
-                      </wps:txbx>
-                      <wps:bodyPr rot="0" spcFirstLastPara="0" vertOverflow="overflow" horzOverflow="overflow" vert="horz" wrap="square" lIns="91440" tIns="45720" rIns="91440" bIns="45720" numCol="1" spcCol="0" rtlCol="0" fromWordArt="0" anchor="t" anchorCtr="0" forceAA="0" compatLnSpc="1">
-                        <a:prstTxWarp prst="textNoShape">
-                          <a:avLst/>
-                        </a:prstTxWarp>
-                        <a:noAutofit/>
-                      </wps:bodyPr>
-                    </wps:wsp>
-                  </a:graphicData>
-                </a:graphic>
-                <wp14:sizeRelH relativeFrom="margin">
-                  <wp14:pctWidth>0</wp14:pctWidth>
-                </wp14:sizeRelH>
-                <wp14:sizeRelV relativeFrom="margin">
-                  <wp14:pctHeight>0</wp14:pctHeight>
-                </wp14:sizeRelV>
-              </wp:anchor>
-            </w:drawing>
-          </mc:Choice>
-          <mc:Fallback>
-            <w:pict>
-              <v:shape w14:anchorId="328FD266" id="Text Box 4" o:spid="_x0000_s1027" type="#_x0000_t202" style="position:absolute;margin-left:-20.25pt;margin-top:-20.45pt;width:306.75pt;height:129pt;z-index:251659264;visibility:visible;mso-wrap-style:square;mso-width-percent:0;mso-height-percent:0;mso-wrap-distance-left:9pt;mso-wrap-distance-top:0;mso-wrap-distance-right:9pt;mso-wrap-distance-bottom:0;mso-position-horizontal:absolute;mso-position-horizontal-relative:text;mso-position-vertical:absolute;mso-position-vertical-relative:text;mso-width-percent:0;mso-height-percent:0;mso-width-relative:margin;mso-height-relative:margin;v-text-anchor:top" o:gfxdata="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" filled="f" stroked="f">
-                <v:textbox>
-                  <w:txbxContent>
-                    <w:p>
-                      <w:r>
-                        <w:t>{#header_</w:t>
-                      </w:r>
-                      <w:proofErr w:type="gramStart"/>
-                      <w:r>
-                        <w:t>show}{</w:t>
-                      </w:r>
-                      <w:proofErr w:type="gramEnd"/>
-                      <w:r>
-                        <w:t>#header_logo_only}</w:t>
-                      </w:r>
-                      <w:r>
-                        <w:t>{%header_logo}</w:t>
-                      </w:r>
-                      <w:r>
-                        <w:t>{</w:t>
-                      </w:r>
-                      <w:r>
-                        <w:rPr>
-                          <w:lang w:val="en-US"/>
-                        </w:rPr>
-                        <w:t>/</w:t>
-                      </w:r>
-                      <w:proofErr w:type="spellStart"/>
-                      <w:r>
-                        <w:rPr>
-                          <w:lang w:val="en-US"/>
-                        </w:rPr>
-                        <w:t>header_logo_only</w:t>
-                      </w:r>
-                      <w:proofErr w:type="spellEnd"/>
-                      <w:r>
-                        <w:t>}</w:t>
-                      </w:r>
-                      <w:r>
-                        <w:t>{#header_show_full}</w:t>
-                      </w:r>
-                      <w:r>
-                        <w:t>{%header_logo}</w:t>
-                      </w:r>
-                      <w:r>
-                        <w:t>{/header_show_full}{/header_show}</w:t>
-                      </w:r>
                     </w:p>
                   </w:txbxContent>
                 </v:textbox>
@@ -1033,7 +1359,15 @@
               </w:rPr>
             </w:pPr>
             <w:r>
-              <w:t>{instruction_no}</w:t>
+              <w:t>{</w:t>
+            </w:r>
+            <w:proofErr w:type="spellStart"/>
+            <w:r>
+              <w:t>instruction_no</w:t>
+            </w:r>
+            <w:proofErr w:type="spellEnd"/>
+            <w:r>
+              <w:t>}</w:t>
             </w:r>
           </w:p>
         </w:tc>
@@ -1062,6 +1396,7 @@
             <w:r>
               <w:t>{</w:t>
             </w:r>
+            <w:proofErr w:type="spellStart"/>
             <w:r>
               <w:rPr>
                 <w:lang w:val="en-US"/>
@@ -1082,6 +1417,7 @@
               </w:rPr>
               <w:t>_Created__c</w:t>
             </w:r>
+            <w:proofErr w:type="spellEnd"/>
             <w:r>
               <w:t>}</w:t>
             </w:r>
@@ -1118,6 +1454,7 @@
               </w:rPr>
               <w:t>Movement_Sheet__</w:t>
             </w:r>
+            <w:proofErr w:type="spellStart"/>
             <w:proofErr w:type="gramStart"/>
             <w:r>
               <w:rPr>
@@ -1125,6 +1462,7 @@
               </w:rPr>
               <w:t>c.Name</w:t>
             </w:r>
+            <w:proofErr w:type="spellEnd"/>
             <w:proofErr w:type="gramEnd"/>
             <w:r>
               <w:t>}</w:t>
@@ -1189,6 +1527,7 @@
             <w:r>
               <w:t>Haulier__</w:t>
             </w:r>
+            <w:proofErr w:type="spellStart"/>
             <w:proofErr w:type="gramStart"/>
             <w:r>
               <w:t>c</w:t>
@@ -1196,6 +1535,7 @@
             <w:r>
               <w:t>.Name</w:t>
             </w:r>
+            <w:proofErr w:type="spellEnd"/>
             <w:proofErr w:type="gramEnd"/>
             <w:r>
               <w:t>}</w:t>
@@ -1247,7 +1587,11 @@
               </w:rPr>
             </w:pPr>
             <w:r>
-              <w:t>{Haulage_Instruction__</w:t>
+              <w:t>{</w:t>
+            </w:r>
+            <w:proofErr w:type="spellStart"/>
+            <w:r>
+              <w:t>Haulage_Instruction__</w:t>
             </w:r>
             <w:proofErr w:type="gramStart"/>
             <w:r>
@@ -1255,7 +1599,11 @@
             </w:r>
             <w:proofErr w:type="gramEnd"/>
             <w:r>
-              <w:t>__c}</w:t>
+              <w:t>__c</w:t>
+            </w:r>
+            <w:proofErr w:type="spellEnd"/>
+            <w:r>
+              <w:t>}</w:t>
             </w:r>
           </w:p>
         </w:tc>
@@ -1287,6 +1635,7 @@
             <w:r>
               <w:t>{</w:t>
             </w:r>
+            <w:proofErr w:type="spellStart"/>
             <w:r>
               <w:rPr>
                 <w:lang w:val="en-US"/>
@@ -1307,9 +1656,11 @@
               </w:rPr>
               <w:t>_Name__c</w:t>
             </w:r>
+            <w:proofErr w:type="spellEnd"/>
             <w:r>
               <w:t>} {</w:t>
             </w:r>
+            <w:proofErr w:type="spellStart"/>
             <w:r>
               <w:t>Haulage_Instruction__c</w:t>
             </w:r>
@@ -1319,6 +1670,7 @@
             <w:r>
               <w:t>Telephone__c</w:t>
             </w:r>
+            <w:proofErr w:type="spellEnd"/>
             <w:r>
               <w:t>}</w:t>
             </w:r>
@@ -1408,11 +1760,16 @@
             </w:r>
             <w:proofErr w:type="gramEnd"/>
             <w:r>
-              <w:t>__c</w:t>
+              <w:t>__</w:t>
+            </w:r>
+            <w:proofErr w:type="spellStart"/>
+            <w:r>
+              <w:t>c</w:t>
             </w:r>
             <w:r>
               <w:t>.Name</w:t>
             </w:r>
+            <w:proofErr w:type="spellEnd"/>
             <w:r>
               <w:t>} {</w:t>
             </w:r>
@@ -1423,11 +1780,16 @@
               <w:t>.</w:t>
             </w:r>
             <w:r>
-              <w:t>Commodity__c</w:t>
+              <w:t>Commodity__</w:t>
+            </w:r>
+            <w:proofErr w:type="spellStart"/>
+            <w:r>
+              <w:t>c</w:t>
             </w:r>
             <w:r>
               <w:t>.Name</w:t>
             </w:r>
+            <w:proofErr w:type="spellEnd"/>
             <w:r>
               <w:t>}</w:t>
             </w:r>
@@ -1459,6 +1821,7 @@
               </w:rPr>
               <w:t>{</w:t>
             </w:r>
+            <w:proofErr w:type="spellStart"/>
             <w:r>
               <w:rPr>
                 <w:bCs/>
@@ -1491,6 +1854,7 @@
               </w:rPr>
               <w:t>__c</w:t>
             </w:r>
+            <w:proofErr w:type="spellEnd"/>
             <w:r>
               <w:rPr>
                 <w:bCs/>
@@ -1546,6 +1910,7 @@
             <w:r>
               <w:t>{</w:t>
             </w:r>
+            <w:proofErr w:type="spellStart"/>
             <w:r>
               <w:rPr>
                 <w:lang w:val="en-US"/>
@@ -1566,6 +1931,7 @@
               </w:rPr>
               <w:t>__c</w:t>
             </w:r>
+            <w:proofErr w:type="spellEnd"/>
             <w:r>
               <w:t>}</w:t>
             </w:r>
@@ -1619,6 +1985,7 @@
               </w:rPr>
               <w:t>{</w:t>
             </w:r>
+            <w:proofErr w:type="spellStart"/>
             <w:r>
               <w:rPr>
                 <w:bCs/>
@@ -1642,6 +2009,7 @@
               </w:rPr>
               <w:t>_Reference_No__c</w:t>
             </w:r>
+            <w:proofErr w:type="spellEnd"/>
             <w:r>
               <w:rPr>
                 <w:bCs/>
@@ -1723,7 +2091,15 @@
               </w:rPr>
             </w:pPr>
             <w:r>
-              <w:t>{delivery_date}</w:t>
+              <w:t>{</w:t>
+            </w:r>
+            <w:proofErr w:type="spellStart"/>
+            <w:r>
+              <w:t>delivery_date</w:t>
+            </w:r>
+            <w:proofErr w:type="spellEnd"/>
+            <w:r>
+              <w:t>}</w:t>
             </w:r>
           </w:p>
         </w:tc>
@@ -1733,18 +2109,34 @@
           </w:tcPr>
           <w:p>
             <w:r>
-              <w:t>{booking_</w:t>
+              <w:t>{</w:t>
+            </w:r>
+            <w:proofErr w:type="spellStart"/>
+            <w:r>
+              <w:t>booking_</w:t>
             </w:r>
             <w:proofErr w:type="gramStart"/>
             <w:r>
-              <w:t>reference}</w:t>
+              <w:t>reference</w:t>
+            </w:r>
+            <w:proofErr w:type="spellEnd"/>
+            <w:r>
+              <w:t>}</w:t>
             </w:r>
             <w:r>
               <w:t>{</w:t>
             </w:r>
             <w:proofErr w:type="gramEnd"/>
             <w:r>
-              <w:t>/haulage_instruction_delivery_rows}</w:t>
+              <w:t>/</w:t>
+            </w:r>
+            <w:proofErr w:type="spellStart"/>
+            <w:r>
+              <w:t>haulage_instruction_delivery_rows</w:t>
+            </w:r>
+            <w:proofErr w:type="spellEnd"/>
+            <w:r>
+              <w:t>}</w:t>
             </w:r>
           </w:p>
         </w:tc>
@@ -1805,6 +2197,7 @@
             <w:r>
               <w:t>{</w:t>
             </w:r>
+            <w:proofErr w:type="spellStart"/>
             <w:r>
               <w:t>Haulage_Instruction__</w:t>
             </w:r>
@@ -1822,6 +2215,7 @@
             <w:r>
               <w:t>_Rate__c</w:t>
             </w:r>
+            <w:proofErr w:type="spellEnd"/>
             <w:r>
               <w:t>}</w:t>
             </w:r>
@@ -2980,6 +3374,7 @@
   <w:style w:type="character" w:default="1" w:styleId="DefaultParagraphFont">
     <w:name w:val="Default Paragraph Font"/>
     <w:uiPriority w:val="1"/>
+    <w:semiHidden/>
     <w:unhideWhenUsed/>
   </w:style>
   <w:style w:type="table" w:default="1" w:styleId="TableNormal">

</xml_diff>

<commit_message>
added invoice mapping, fixed text from cmdt and cs
</commit_message>
<xml_diff>
--- a/src/templates/template_Haulage_Instruction.docx
+++ b/src/templates/template_Haulage_Instruction.docx
@@ -206,7 +206,7 @@
         <mc:AlternateContent>
           <mc:Choice Requires="wps">
             <w:drawing>
-              <wp:anchor distT="0" distB="0" distL="114300" distR="114300" simplePos="0" relativeHeight="251660288" behindDoc="0" locked="0" layoutInCell="1" allowOverlap="1" wp14:anchorId="1DB04DF8" wp14:editId="53FB71D2">
+              <wp:anchor distT="0" distB="0" distL="114300" distR="114300" simplePos="0" relativeHeight="251660288" behindDoc="0" locked="0" layoutInCell="1" allowOverlap="1" wp14:anchorId="1DB04DF8" wp14:editId="7F7B1FE6">
                 <wp:simplePos x="0" y="0"/>
                 <wp:positionH relativeFrom="column">
                   <wp:posOffset>1809750</wp:posOffset>
@@ -1296,6 +1296,21 @@
         <w:rPr>
           <w:sz w:val="26"/>
           <w:szCs w:val="26"/>
+          <w:lang w:val="ru-RU"/>
+        </w:rPr>
+      </w:pPr>
+    </w:p>
+    <w:p>
+      <w:pPr>
+        <w:widowControl w:val="0"/>
+        <w:autoSpaceDE w:val="0"/>
+        <w:autoSpaceDN w:val="0"/>
+        <w:adjustRightInd w:val="0"/>
+        <w:jc w:val="center"/>
+        <w:rPr>
+          <w:sz w:val="26"/>
+          <w:szCs w:val="26"/>
+          <w:lang w:val="ru-RU"/>
         </w:rPr>
       </w:pPr>
     </w:p>
@@ -1319,7 +1334,21 @@
         <w:t>HAULAGE INSTRUCTIONS</w:t>
       </w:r>
     </w:p>
-    <w:p/>
+    <w:p>
+      <w:pPr>
+        <w:widowControl w:val="0"/>
+        <w:autoSpaceDE w:val="0"/>
+        <w:autoSpaceDN w:val="0"/>
+        <w:adjustRightInd w:val="0"/>
+        <w:rPr>
+          <w:b/>
+          <w:bCs/>
+          <w:sz w:val="28"/>
+          <w:szCs w:val="28"/>
+          <w:lang w:val="ru-RU"/>
+        </w:rPr>
+      </w:pPr>
+    </w:p>
     <w:tbl>
       <w:tblPr>
         <w:tblW w:w="0" w:type="auto"/>
@@ -1334,13 +1363,20 @@
         <w:tblLook w:val="01E0" w:firstRow="1" w:lastRow="1" w:firstColumn="1" w:lastColumn="1" w:noHBand="0" w:noVBand="0"/>
       </w:tblPr>
       <w:tblGrid>
-        <w:gridCol w:w="2819"/>
-        <w:gridCol w:w="7616"/>
+        <w:gridCol w:w="3511"/>
+        <w:gridCol w:w="2426"/>
+        <w:gridCol w:w="4519"/>
       </w:tblGrid>
       <w:tr>
         <w:tc>
           <w:tcPr>
-            <w:tcW w:w="2819" w:type="dxa"/>
+            <w:tcW w:w="4788" w:type="dxa"/>
+          </w:tcPr>
+          <w:p/>
+        </w:tc>
+        <w:tc>
+          <w:tcPr>
+            <w:tcW w:w="2880" w:type="dxa"/>
           </w:tcPr>
           <w:p>
             <w:r>
@@ -1350,14 +1386,9 @@
         </w:tc>
         <w:tc>
           <w:tcPr>
-            <w:tcW w:w="7616" w:type="dxa"/>
+            <w:tcW w:w="3128" w:type="dxa"/>
           </w:tcPr>
           <w:p>
-            <w:pPr>
-              <w:rPr>
-                <w:lang w:val="en-US"/>
-              </w:rPr>
-            </w:pPr>
             <w:r>
               <w:t>{</w:t>
             </w:r>
@@ -1375,7 +1406,13 @@
       <w:tr>
         <w:tc>
           <w:tcPr>
-            <w:tcW w:w="2819" w:type="dxa"/>
+            <w:tcW w:w="4788" w:type="dxa"/>
+          </w:tcPr>
+          <w:p/>
+        </w:tc>
+        <w:tc>
+          <w:tcPr>
+            <w:tcW w:w="2880" w:type="dxa"/>
           </w:tcPr>
           <w:p>
             <w:r>
@@ -1385,14 +1422,9 @@
         </w:tc>
         <w:tc>
           <w:tcPr>
-            <w:tcW w:w="7616" w:type="dxa"/>
+            <w:tcW w:w="3128" w:type="dxa"/>
           </w:tcPr>
           <w:p>
-            <w:pPr>
-              <w:rPr>
-                <w:lang w:val="en-US"/>
-              </w:rPr>
-            </w:pPr>
             <w:r>
               <w:t>{</w:t>
             </w:r>
@@ -1427,7 +1459,13 @@
       <w:tr>
         <w:tc>
           <w:tcPr>
-            <w:tcW w:w="2819" w:type="dxa"/>
+            <w:tcW w:w="4788" w:type="dxa"/>
+          </w:tcPr>
+          <w:p/>
+        </w:tc>
+        <w:tc>
+          <w:tcPr>
+            <w:tcW w:w="2880" w:type="dxa"/>
           </w:tcPr>
           <w:p>
             <w:r>
@@ -1437,14 +1475,9 @@
         </w:tc>
         <w:tc>
           <w:tcPr>
-            <w:tcW w:w="7616" w:type="dxa"/>
+            <w:tcW w:w="3128" w:type="dxa"/>
           </w:tcPr>
           <w:p>
-            <w:pPr>
-              <w:rPr>
-                <w:lang w:val="en-US"/>
-              </w:rPr>
-            </w:pPr>
             <w:r>
               <w:t>{</w:t>
             </w:r>
@@ -1482,6 +1515,7 @@
           <w:bCs/>
           <w:sz w:val="28"/>
           <w:szCs w:val="28"/>
+          <w:lang w:val="ru-RU"/>
         </w:rPr>
       </w:pPr>
     </w:p>

</xml_diff>